<commit_message>
Update age eligibility criteria in policy confirmation email template for clarity
</commit_message>
<xml_diff>
--- a/expedia/hk/en/expedia-hk-en.docx
+++ b/expedia/hk/en/expedia-hk-en.docx
@@ -2767,8 +2767,10 @@
       </w:pPr>
     </w:p>
     <w:sectPr>
-      <w:footerReference w:type="default" r:id="rId12"/>
-      <w:headerReference w:type="first" r:id="rId13"/>
+      <w:footerReference w:type="even" r:id="rId12"/>
+      <w:footerReference w:type="default" r:id="rId13"/>
+      <w:headerReference w:type="first" r:id="rId14"/>
+      <w:footerReference w:type="first" r:id="rId15"/>
       <w:type w:val="continuous"/>
       <w:pgSz w:w="12240" w:h="15840"/>
       <w:pgMar w:top="1152" w:right="720" w:bottom="1440" w:left="720" w:header="720" w:footer="144" w:gutter="216"/>
@@ -2817,6 +2819,137 @@
 <w:ftr xmlns:wpc="http://schemas.microsoft.com/office/word/2010/wordprocessingCanvas" xmlns:cx="http://schemas.microsoft.com/office/drawing/2014/chartex" xmlns:cx1="http://schemas.microsoft.com/office/drawing/2015/9/8/chartex" xmlns:cx2="http://schemas.microsoft.com/office/drawing/2015/10/21/chartex" xmlns:cx3="http://schemas.microsoft.com/office/drawing/2016/5/9/chartex" xmlns:cx4="http://schemas.microsoft.com/office/drawing/2016/5/10/chartex" xmlns:cx5="http://schemas.microsoft.com/office/drawing/2016/5/11/chartex" xmlns:cx6="http://schemas.microsoft.com/office/drawing/2016/5/12/chartex" xmlns:cx7="http://schemas.microsoft.com/office/drawing/2016/5/13/chartex" xmlns:cx8="http://schemas.microsoft.com/office/drawing/2016/5/14/chartex" xmlns:mc="http://schemas.openxmlformats.org/markup-compatibility/2006" xmlns:aink="http://schemas.microsoft.com/office/drawing/2016/ink" xmlns:am3d="http://schemas.microsoft.com/office/drawing/2017/model3d" xmlns:o="urn:schemas-microsoft-com:office:office" xmlns:oel="http://schemas.microsoft.com/office/2019/extlst" xmlns:r="http://schemas.openxmlformats.org/officeDocument/2006/relationships" xmlns:m="http://schemas.openxmlformats.org/officeDocument/2006/math" xmlns:v="urn:schemas-microsoft-com:vml" xmlns:wp14="http://schemas.microsoft.com/office/word/2010/wordprocessingDrawing" xmlns:wp="http://schemas.openxmlformats.org/drawingml/2006/wordprocessingDrawing" xmlns:w10="urn:schemas-microsoft-com:office:word" xmlns:w="http://schemas.openxmlformats.org/wordprocessingml/2006/main" xmlns:w14="http://schemas.microsoft.com/office/word/2010/wordml" xmlns:w15="http://schemas.microsoft.com/office/word/2012/wordml" xmlns:w16cex="http://schemas.microsoft.com/office/word/2018/wordml/cex" xmlns:w16cid="http://schemas.microsoft.com/office/word/2016/wordml/cid" xmlns:w16="http://schemas.microsoft.com/office/word/2018/wordml" xmlns:w16du="http://schemas.microsoft.com/office/word/2023/wordml/word16du" xmlns:w16sdtdh="http://schemas.microsoft.com/office/word/2020/wordml/sdtdatahash" xmlns:w16sdtfl="http://schemas.microsoft.com/office/word/2024/wordml/sdtformatlock" xmlns:w16se="http://schemas.microsoft.com/office/word/2015/wordml/symex" xmlns:wpg="http://schemas.microsoft.com/office/word/2010/wordprocessingGroup" xmlns:wpi="http://schemas.microsoft.com/office/word/2010/wordprocessingInk" xmlns:wne="http://schemas.microsoft.com/office/word/2006/wordml" xmlns:wps="http://schemas.microsoft.com/office/word/2010/wordprocessingShape" mc:Ignorable="w14 w15 w16se w16cid w16 w16cex w16sdtdh w16sdtfl w16du wp14">
   <w:p>
     <w:pPr>
+      <w:pStyle w:val="Footer"/>
+    </w:pPr>
+    <w:r>
+      <w:rPr>
+        <w:noProof/>
+      </w:rPr>
+      <mc:AlternateContent>
+        <mc:Choice Requires="wps">
+          <w:drawing>
+            <wp:anchor distT="0" distB="0" distL="0" distR="0" simplePos="0" relativeHeight="251660288" behindDoc="0" locked="0" layoutInCell="1" allowOverlap="1" wp14:anchorId="77C3EF5D" wp14:editId="5B8D2FD8">
+              <wp:simplePos x="635" y="635"/>
+              <wp:positionH relativeFrom="page">
+                <wp:align>left</wp:align>
+              </wp:positionH>
+              <wp:positionV relativeFrom="page">
+                <wp:align>bottom</wp:align>
+              </wp:positionV>
+              <wp:extent cx="1408430" cy="357505"/>
+              <wp:effectExtent l="0" t="0" r="1270" b="0"/>
+              <wp:wrapNone/>
+              <wp:docPr id="1429231248" name="Text Box 2" descr="INTERNAL USE ONLY">
+                <a:extLst xmlns:a="http://schemas.openxmlformats.org/drawingml/2006/main">
+                  <a:ext uri="{5AE41FA2-C0FF-4470-9BD4-5FADCA87CBE2}">
+                    <aclsh:classification xmlns:aclsh="http://schemas.microsoft.com/office/drawing/2020/classificationShape" classificationOutcomeType="ftr"/>
+                  </a:ext>
+                </a:extLst>
+              </wp:docPr>
+              <wp:cNvGraphicFramePr/>
+              <a:graphic xmlns:a="http://schemas.openxmlformats.org/drawingml/2006/main">
+                <a:graphicData uri="http://schemas.microsoft.com/office/word/2010/wordprocessingShape">
+                  <wps:wsp>
+                    <wps:cNvSpPr txBox="1"/>
+                    <wps:spPr>
+                      <a:xfrm>
+                        <a:off x="0" y="0"/>
+                        <a:ext cx="1408430" cy="357505"/>
+                      </a:xfrm>
+                      <a:prstGeom prst="rect">
+                        <a:avLst/>
+                      </a:prstGeom>
+                      <a:noFill/>
+                      <a:ln>
+                        <a:noFill/>
+                      </a:ln>
+                    </wps:spPr>
+                    <wps:txbx>
+                      <w:txbxContent>
+                        <w:p>
+                          <w:pPr>
+                            <w:spacing w:after="0"/>
+                            <w:rPr>
+                              <w:rFonts w:ascii="Aptos" w:eastAsia="Aptos" w:hAnsi="Aptos" w:cs="Aptos"/>
+                              <w:noProof/>
+                              <w:color w:val="000000"/>
+                              <w:sz w:val="20"/>
+                              <w:szCs w:val="20"/>
+                            </w:rPr>
+                          </w:pPr>
+                          <w:r>
+                            <w:rPr>
+                              <w:rFonts w:ascii="Aptos" w:eastAsia="Aptos" w:hAnsi="Aptos" w:cs="Aptos"/>
+                              <w:noProof/>
+                              <w:color w:val="000000"/>
+                              <w:sz w:val="20"/>
+                              <w:szCs w:val="20"/>
+                            </w:rPr>
+                            <w:t>INTERNAL USE ONLY</w:t>
+                          </w:r>
+                        </w:p>
+                      </w:txbxContent>
+                    </wps:txbx>
+                    <wps:bodyPr rot="0" spcFirstLastPara="0" vertOverflow="overflow" horzOverflow="overflow" vert="horz" wrap="none" lIns="254000" tIns="0" rIns="0" bIns="190500" numCol="1" spcCol="0" rtlCol="0" fromWordArt="0" anchor="b" anchorCtr="0" forceAA="0" compatLnSpc="1">
+                      <a:prstTxWarp prst="textNoShape">
+                        <a:avLst/>
+                      </a:prstTxWarp>
+                      <a:spAutoFit/>
+                    </wps:bodyPr>
+                  </wps:wsp>
+                </a:graphicData>
+              </a:graphic>
+            </wp:anchor>
+          </w:drawing>
+        </mc:Choice>
+        <mc:Fallback>
+          <w:pict>
+            <v:shapetype w14:anchorId="77C3EF5D" id="_x0000_t202" coordsize="21600,21600" o:spt="202" path="m,l,21600r21600,l21600,xe">
+              <v:stroke joinstyle="miter"/>
+              <v:path gradientshapeok="t" o:connecttype="rect"/>
+            </v:shapetype>
+            <v:shape id="Text Box 2" o:spid="_x0000_s1026" type="#_x0000_t202" alt="INTERNAL USE ONLY" style="position:absolute;margin-left:0;margin-top:0;width:110.9pt;height:28.15pt;z-index:251660288;visibility:visible;mso-wrap-style:none;mso-wrap-distance-left:0;mso-wrap-distance-top:0;mso-wrap-distance-right:0;mso-wrap-distance-bottom:0;mso-position-horizontal:left;mso-position-horizontal-relative:page;mso-position-vertical:bottom;mso-position-vertical-relative:page;v-text-anchor:bottom" o:gfxdata="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" filled="f" stroked="f">
+              <v:fill o:detectmouseclick="t"/>
+              <v:textbox style="mso-fit-shape-to-text:t" inset="20pt,0,0,15pt">
+                <w:txbxContent>
+                  <w:p>
+                    <w:pPr>
+                      <w:spacing w:after="0"/>
+                      <w:rPr>
+                        <w:rFonts w:ascii="Aptos" w:eastAsia="Aptos" w:hAnsi="Aptos" w:cs="Aptos"/>
+                        <w:noProof/>
+                        <w:color w:val="000000"/>
+                        <w:sz w:val="20"/>
+                        <w:szCs w:val="20"/>
+                      </w:rPr>
+                    </w:pPr>
+                    <w:r>
+                      <w:rPr>
+                        <w:rFonts w:ascii="Aptos" w:eastAsia="Aptos" w:hAnsi="Aptos" w:cs="Aptos"/>
+                        <w:noProof/>
+                        <w:color w:val="000000"/>
+                        <w:sz w:val="20"/>
+                        <w:szCs w:val="20"/>
+                      </w:rPr>
+                      <w:t>INTERNAL USE ONLY</w:t>
+                    </w:r>
+                  </w:p>
+                </w:txbxContent>
+              </v:textbox>
+              <w10:wrap anchorx="page" anchory="page"/>
+            </v:shape>
+          </w:pict>
+        </mc:Fallback>
+      </mc:AlternateContent>
+    </w:r>
+  </w:p>
+</w:ftr>
+</file>
+
+<file path=word/footer2.xml><?xml version="1.0" encoding="utf-8"?>
+<w:ftr xmlns:wpc="http://schemas.microsoft.com/office/word/2010/wordprocessingCanvas" xmlns:cx="http://schemas.microsoft.com/office/drawing/2014/chartex" xmlns:cx1="http://schemas.microsoft.com/office/drawing/2015/9/8/chartex" xmlns:cx2="http://schemas.microsoft.com/office/drawing/2015/10/21/chartex" xmlns:cx3="http://schemas.microsoft.com/office/drawing/2016/5/9/chartex" xmlns:cx4="http://schemas.microsoft.com/office/drawing/2016/5/10/chartex" xmlns:cx5="http://schemas.microsoft.com/office/drawing/2016/5/11/chartex" xmlns:cx6="http://schemas.microsoft.com/office/drawing/2016/5/12/chartex" xmlns:cx7="http://schemas.microsoft.com/office/drawing/2016/5/13/chartex" xmlns:cx8="http://schemas.microsoft.com/office/drawing/2016/5/14/chartex" xmlns:mc="http://schemas.openxmlformats.org/markup-compatibility/2006" xmlns:aink="http://schemas.microsoft.com/office/drawing/2016/ink" xmlns:am3d="http://schemas.microsoft.com/office/drawing/2017/model3d" xmlns:o="urn:schemas-microsoft-com:office:office" xmlns:oel="http://schemas.microsoft.com/office/2019/extlst" xmlns:r="http://schemas.openxmlformats.org/officeDocument/2006/relationships" xmlns:m="http://schemas.openxmlformats.org/officeDocument/2006/math" xmlns:v="urn:schemas-microsoft-com:vml" xmlns:wp14="http://schemas.microsoft.com/office/word/2010/wordprocessingDrawing" xmlns:wp="http://schemas.openxmlformats.org/drawingml/2006/wordprocessingDrawing" xmlns:w10="urn:schemas-microsoft-com:office:word" xmlns:w="http://schemas.openxmlformats.org/wordprocessingml/2006/main" xmlns:w14="http://schemas.microsoft.com/office/word/2010/wordml" xmlns:w15="http://schemas.microsoft.com/office/word/2012/wordml" xmlns:w16cex="http://schemas.microsoft.com/office/word/2018/wordml/cex" xmlns:w16cid="http://schemas.microsoft.com/office/word/2016/wordml/cid" xmlns:w16="http://schemas.microsoft.com/office/word/2018/wordml" xmlns:w16du="http://schemas.microsoft.com/office/word/2023/wordml/word16du" xmlns:w16sdtdh="http://schemas.microsoft.com/office/word/2020/wordml/sdtdatahash" xmlns:w16sdtfl="http://schemas.microsoft.com/office/word/2024/wordml/sdtformatlock" xmlns:w16se="http://schemas.microsoft.com/office/word/2015/wordml/symex" xmlns:wpg="http://schemas.microsoft.com/office/word/2010/wordprocessingGroup" xmlns:wpi="http://schemas.microsoft.com/office/word/2010/wordprocessingInk" xmlns:wne="http://schemas.microsoft.com/office/word/2006/wordml" xmlns:wps="http://schemas.microsoft.com/office/word/2010/wordprocessingShape" mc:Ignorable="w14 w15 w16se w16cid w16 w16cex w16sdtdh w16sdtfl w16du wp14">
+  <w:p>
+    <w:pPr>
       <w:jc w:val="right"/>
       <w:rPr>
         <w:rFonts w:ascii="Segoe UI" w:hAnsi="Segoe UI" w:cs="Segoe UI"/>
@@ -2824,11 +2957,266 @@
         <w:szCs w:val="20"/>
       </w:rPr>
     </w:pPr>
+    <w:r>
+      <w:rPr>
+        <w:rFonts w:ascii="Segoe UI" w:hAnsi="Segoe UI" w:cs="Segoe UI"/>
+        <w:noProof/>
+        <w:color w:val="00A4E4" w:themeColor="accent1"/>
+        <w:szCs w:val="20"/>
+      </w:rPr>
+      <mc:AlternateContent>
+        <mc:Choice Requires="wps">
+          <w:drawing>
+            <wp:anchor distT="0" distB="0" distL="0" distR="0" simplePos="0" relativeHeight="251661312" behindDoc="0" locked="0" layoutInCell="1" allowOverlap="1" wp14:anchorId="18FE64E3" wp14:editId="0DFFB484">
+              <wp:simplePos x="590550" y="9391650"/>
+              <wp:positionH relativeFrom="page">
+                <wp:align>left</wp:align>
+              </wp:positionH>
+              <wp:positionV relativeFrom="page">
+                <wp:align>bottom</wp:align>
+              </wp:positionV>
+              <wp:extent cx="1408430" cy="357505"/>
+              <wp:effectExtent l="0" t="0" r="1270" b="0"/>
+              <wp:wrapNone/>
+              <wp:docPr id="1763602669" name="Text Box 3" descr="INTERNAL USE ONLY">
+                <a:extLst xmlns:a="http://schemas.openxmlformats.org/drawingml/2006/main">
+                  <a:ext uri="{5AE41FA2-C0FF-4470-9BD4-5FADCA87CBE2}">
+                    <aclsh:classification xmlns:aclsh="http://schemas.microsoft.com/office/drawing/2020/classificationShape" classificationOutcomeType="ftr"/>
+                  </a:ext>
+                </a:extLst>
+              </wp:docPr>
+              <wp:cNvGraphicFramePr/>
+              <a:graphic xmlns:a="http://schemas.openxmlformats.org/drawingml/2006/main">
+                <a:graphicData uri="http://schemas.microsoft.com/office/word/2010/wordprocessingShape">
+                  <wps:wsp>
+                    <wps:cNvSpPr txBox="1"/>
+                    <wps:spPr>
+                      <a:xfrm>
+                        <a:off x="0" y="0"/>
+                        <a:ext cx="1408430" cy="357505"/>
+                      </a:xfrm>
+                      <a:prstGeom prst="rect">
+                        <a:avLst/>
+                      </a:prstGeom>
+                      <a:noFill/>
+                      <a:ln>
+                        <a:noFill/>
+                      </a:ln>
+                    </wps:spPr>
+                    <wps:txbx>
+                      <w:txbxContent>
+                        <w:p>
+                          <w:pPr>
+                            <w:spacing w:after="0"/>
+                            <w:rPr>
+                              <w:rFonts w:ascii="Aptos" w:eastAsia="Aptos" w:hAnsi="Aptos" w:cs="Aptos"/>
+                              <w:noProof/>
+                              <w:color w:val="000000"/>
+                              <w:sz w:val="20"/>
+                              <w:szCs w:val="20"/>
+                            </w:rPr>
+                          </w:pPr>
+                          <w:r>
+                            <w:rPr>
+                              <w:rFonts w:ascii="Aptos" w:eastAsia="Aptos" w:hAnsi="Aptos" w:cs="Aptos"/>
+                              <w:noProof/>
+                              <w:color w:val="000000"/>
+                              <w:sz w:val="20"/>
+                              <w:szCs w:val="20"/>
+                            </w:rPr>
+                            <w:t>INTERNAL USE ONLY</w:t>
+                          </w:r>
+                        </w:p>
+                      </w:txbxContent>
+                    </wps:txbx>
+                    <wps:bodyPr rot="0" spcFirstLastPara="0" vertOverflow="overflow" horzOverflow="overflow" vert="horz" wrap="none" lIns="254000" tIns="0" rIns="0" bIns="190500" numCol="1" spcCol="0" rtlCol="0" fromWordArt="0" anchor="b" anchorCtr="0" forceAA="0" compatLnSpc="1">
+                      <a:prstTxWarp prst="textNoShape">
+                        <a:avLst/>
+                      </a:prstTxWarp>
+                      <a:spAutoFit/>
+                    </wps:bodyPr>
+                  </wps:wsp>
+                </a:graphicData>
+              </a:graphic>
+            </wp:anchor>
+          </w:drawing>
+        </mc:Choice>
+        <mc:Fallback>
+          <w:pict>
+            <v:shapetype w14:anchorId="18FE64E3" id="_x0000_t202" coordsize="21600,21600" o:spt="202" path="m,l,21600r21600,l21600,xe">
+              <v:stroke joinstyle="miter"/>
+              <v:path gradientshapeok="t" o:connecttype="rect"/>
+            </v:shapetype>
+            <v:shape id="Text Box 3" o:spid="_x0000_s1027" type="#_x0000_t202" alt="INTERNAL USE ONLY" style="position:absolute;left:0;text-align:left;margin-left:0;margin-top:0;width:110.9pt;height:28.15pt;z-index:251661312;visibility:visible;mso-wrap-style:none;mso-wrap-distance-left:0;mso-wrap-distance-top:0;mso-wrap-distance-right:0;mso-wrap-distance-bottom:0;mso-position-horizontal:left;mso-position-horizontal-relative:page;mso-position-vertical:bottom;mso-position-vertical-relative:page;v-text-anchor:bottom" o:gfxdata="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" filled="f" stroked="f">
+              <v:fill o:detectmouseclick="t"/>
+              <v:textbox style="mso-fit-shape-to-text:t" inset="20pt,0,0,15pt">
+                <w:txbxContent>
+                  <w:p>
+                    <w:pPr>
+                      <w:spacing w:after="0"/>
+                      <w:rPr>
+                        <w:rFonts w:ascii="Aptos" w:eastAsia="Aptos" w:hAnsi="Aptos" w:cs="Aptos"/>
+                        <w:noProof/>
+                        <w:color w:val="000000"/>
+                        <w:sz w:val="20"/>
+                        <w:szCs w:val="20"/>
+                      </w:rPr>
+                    </w:pPr>
+                    <w:r>
+                      <w:rPr>
+                        <w:rFonts w:ascii="Aptos" w:eastAsia="Aptos" w:hAnsi="Aptos" w:cs="Aptos"/>
+                        <w:noProof/>
+                        <w:color w:val="000000"/>
+                        <w:sz w:val="20"/>
+                        <w:szCs w:val="20"/>
+                      </w:rPr>
+                      <w:t>INTERNAL USE ONLY</w:t>
+                    </w:r>
+                  </w:p>
+                </w:txbxContent>
+              </v:textbox>
+              <w10:wrap anchorx="page" anchory="page"/>
+            </v:shape>
+          </w:pict>
+        </mc:Fallback>
+      </mc:AlternateContent>
+    </w:r>
   </w:p>
   <w:p>
     <w:pPr>
       <w:jc w:val="right"/>
     </w:pPr>
+  </w:p>
+</w:ftr>
+</file>
+
+<file path=word/footer3.xml><?xml version="1.0" encoding="utf-8"?>
+<w:ftr xmlns:wpc="http://schemas.microsoft.com/office/word/2010/wordprocessingCanvas" xmlns:cx="http://schemas.microsoft.com/office/drawing/2014/chartex" xmlns:cx1="http://schemas.microsoft.com/office/drawing/2015/9/8/chartex" xmlns:cx2="http://schemas.microsoft.com/office/drawing/2015/10/21/chartex" xmlns:cx3="http://schemas.microsoft.com/office/drawing/2016/5/9/chartex" xmlns:cx4="http://schemas.microsoft.com/office/drawing/2016/5/10/chartex" xmlns:cx5="http://schemas.microsoft.com/office/drawing/2016/5/11/chartex" xmlns:cx6="http://schemas.microsoft.com/office/drawing/2016/5/12/chartex" xmlns:cx7="http://schemas.microsoft.com/office/drawing/2016/5/13/chartex" xmlns:cx8="http://schemas.microsoft.com/office/drawing/2016/5/14/chartex" xmlns:mc="http://schemas.openxmlformats.org/markup-compatibility/2006" xmlns:aink="http://schemas.microsoft.com/office/drawing/2016/ink" xmlns:am3d="http://schemas.microsoft.com/office/drawing/2017/model3d" xmlns:o="urn:schemas-microsoft-com:office:office" xmlns:oel="http://schemas.microsoft.com/office/2019/extlst" xmlns:r="http://schemas.openxmlformats.org/officeDocument/2006/relationships" xmlns:m="http://schemas.openxmlformats.org/officeDocument/2006/math" xmlns:v="urn:schemas-microsoft-com:vml" xmlns:wp14="http://schemas.microsoft.com/office/word/2010/wordprocessingDrawing" xmlns:wp="http://schemas.openxmlformats.org/drawingml/2006/wordprocessingDrawing" xmlns:w10="urn:schemas-microsoft-com:office:word" xmlns:w="http://schemas.openxmlformats.org/wordprocessingml/2006/main" xmlns:w14="http://schemas.microsoft.com/office/word/2010/wordml" xmlns:w15="http://schemas.microsoft.com/office/word/2012/wordml" xmlns:w16cex="http://schemas.microsoft.com/office/word/2018/wordml/cex" xmlns:w16cid="http://schemas.microsoft.com/office/word/2016/wordml/cid" xmlns:w16="http://schemas.microsoft.com/office/word/2018/wordml" xmlns:w16du="http://schemas.microsoft.com/office/word/2023/wordml/word16du" xmlns:w16sdtdh="http://schemas.microsoft.com/office/word/2020/wordml/sdtdatahash" xmlns:w16sdtfl="http://schemas.microsoft.com/office/word/2024/wordml/sdtformatlock" xmlns:w16se="http://schemas.microsoft.com/office/word/2015/wordml/symex" xmlns:wpg="http://schemas.microsoft.com/office/word/2010/wordprocessingGroup" xmlns:wpi="http://schemas.microsoft.com/office/word/2010/wordprocessingInk" xmlns:wne="http://schemas.microsoft.com/office/word/2006/wordml" xmlns:wps="http://schemas.microsoft.com/office/word/2010/wordprocessingShape" mc:Ignorable="w14 w15 w16se w16cid w16 w16cex w16sdtdh w16sdtfl w16du wp14">
+  <w:p>
+    <w:pPr>
+      <w:pStyle w:val="Footer"/>
+    </w:pPr>
+    <w:r>
+      <w:rPr>
+        <w:noProof/>
+      </w:rPr>
+      <mc:AlternateContent>
+        <mc:Choice Requires="wps">
+          <w:drawing>
+            <wp:anchor distT="0" distB="0" distL="0" distR="0" simplePos="0" relativeHeight="251659264" behindDoc="0" locked="0" layoutInCell="1" allowOverlap="1" wp14:anchorId="2B8111C3" wp14:editId="790E3791">
+              <wp:simplePos x="590550" y="9810750"/>
+              <wp:positionH relativeFrom="page">
+                <wp:align>left</wp:align>
+              </wp:positionH>
+              <wp:positionV relativeFrom="page">
+                <wp:align>bottom</wp:align>
+              </wp:positionV>
+              <wp:extent cx="1408430" cy="357505"/>
+              <wp:effectExtent l="0" t="0" r="1270" b="0"/>
+              <wp:wrapNone/>
+              <wp:docPr id="1391054343" name="Text Box 1" descr="INTERNAL USE ONLY">
+                <a:extLst xmlns:a="http://schemas.openxmlformats.org/drawingml/2006/main">
+                  <a:ext uri="{5AE41FA2-C0FF-4470-9BD4-5FADCA87CBE2}">
+                    <aclsh:classification xmlns:aclsh="http://schemas.microsoft.com/office/drawing/2020/classificationShape" classificationOutcomeType="ftr"/>
+                  </a:ext>
+                </a:extLst>
+              </wp:docPr>
+              <wp:cNvGraphicFramePr/>
+              <a:graphic xmlns:a="http://schemas.openxmlformats.org/drawingml/2006/main">
+                <a:graphicData uri="http://schemas.microsoft.com/office/word/2010/wordprocessingShape">
+                  <wps:wsp>
+                    <wps:cNvSpPr txBox="1"/>
+                    <wps:spPr>
+                      <a:xfrm>
+                        <a:off x="0" y="0"/>
+                        <a:ext cx="1408430" cy="357505"/>
+                      </a:xfrm>
+                      <a:prstGeom prst="rect">
+                        <a:avLst/>
+                      </a:prstGeom>
+                      <a:noFill/>
+                      <a:ln>
+                        <a:noFill/>
+                      </a:ln>
+                    </wps:spPr>
+                    <wps:txbx>
+                      <w:txbxContent>
+                        <w:p>
+                          <w:pPr>
+                            <w:spacing w:after="0"/>
+                            <w:rPr>
+                              <w:rFonts w:ascii="Aptos" w:eastAsia="Aptos" w:hAnsi="Aptos" w:cs="Aptos"/>
+                              <w:noProof/>
+                              <w:color w:val="000000"/>
+                              <w:sz w:val="20"/>
+                              <w:szCs w:val="20"/>
+                            </w:rPr>
+                          </w:pPr>
+                          <w:r>
+                            <w:rPr>
+                              <w:rFonts w:ascii="Aptos" w:eastAsia="Aptos" w:hAnsi="Aptos" w:cs="Aptos"/>
+                              <w:noProof/>
+                              <w:color w:val="000000"/>
+                              <w:sz w:val="20"/>
+                              <w:szCs w:val="20"/>
+                            </w:rPr>
+                            <w:t>INTERNAL USE ONLY</w:t>
+                          </w:r>
+                        </w:p>
+                      </w:txbxContent>
+                    </wps:txbx>
+                    <wps:bodyPr rot="0" spcFirstLastPara="0" vertOverflow="overflow" horzOverflow="overflow" vert="horz" wrap="none" lIns="254000" tIns="0" rIns="0" bIns="190500" numCol="1" spcCol="0" rtlCol="0" fromWordArt="0" anchor="b" anchorCtr="0" forceAA="0" compatLnSpc="1">
+                      <a:prstTxWarp prst="textNoShape">
+                        <a:avLst/>
+                      </a:prstTxWarp>
+                      <a:spAutoFit/>
+                    </wps:bodyPr>
+                  </wps:wsp>
+                </a:graphicData>
+              </a:graphic>
+            </wp:anchor>
+          </w:drawing>
+        </mc:Choice>
+        <mc:Fallback>
+          <w:pict>
+            <v:shapetype w14:anchorId="2B8111C3" id="_x0000_t202" coordsize="21600,21600" o:spt="202" path="m,l,21600r21600,l21600,xe">
+              <v:stroke joinstyle="miter"/>
+              <v:path gradientshapeok="t" o:connecttype="rect"/>
+            </v:shapetype>
+            <v:shape id="Text Box 1" o:spid="_x0000_s1028" type="#_x0000_t202" alt="INTERNAL USE ONLY" style="position:absolute;margin-left:0;margin-top:0;width:110.9pt;height:28.15pt;z-index:251659264;visibility:visible;mso-wrap-style:none;mso-wrap-distance-left:0;mso-wrap-distance-top:0;mso-wrap-distance-right:0;mso-wrap-distance-bottom:0;mso-position-horizontal:left;mso-position-horizontal-relative:page;mso-position-vertical:bottom;mso-position-vertical-relative:page;v-text-anchor:bottom" o:gfxdata="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" filled="f" stroked="f">
+              <v:fill o:detectmouseclick="t"/>
+              <v:textbox style="mso-fit-shape-to-text:t" inset="20pt,0,0,15pt">
+                <w:txbxContent>
+                  <w:p>
+                    <w:pPr>
+                      <w:spacing w:after="0"/>
+                      <w:rPr>
+                        <w:rFonts w:ascii="Aptos" w:eastAsia="Aptos" w:hAnsi="Aptos" w:cs="Aptos"/>
+                        <w:noProof/>
+                        <w:color w:val="000000"/>
+                        <w:sz w:val="20"/>
+                        <w:szCs w:val="20"/>
+                      </w:rPr>
+                    </w:pPr>
+                    <w:r>
+                      <w:rPr>
+                        <w:rFonts w:ascii="Aptos" w:eastAsia="Aptos" w:hAnsi="Aptos" w:cs="Aptos"/>
+                        <w:noProof/>
+                        <w:color w:val="000000"/>
+                        <w:sz w:val="20"/>
+                        <w:szCs w:val="20"/>
+                      </w:rPr>
+                      <w:t>INTERNAL USE ONLY</w:t>
+                    </w:r>
+                  </w:p>
+                </w:txbxContent>
+              </v:textbox>
+              <w10:wrap anchorx="page" anchory="page"/>
+            </v:shape>
+          </w:pict>
+        </mc:Fallback>
+      </mc:AlternateContent>
+    </w:r>
   </w:p>
 </w:ftr>
 </file>
@@ -5943,26 +6331,6 @@
 </file>
 
 <file path=customXml/item1.xml><?xml version="1.0" encoding="utf-8"?>
-<p:properties xmlns:p="http://schemas.microsoft.com/office/2006/metadata/properties" xmlns:xsi="http://www.w3.org/2001/XMLSchema-instance" xmlns:pc="http://schemas.microsoft.com/office/infopath/2007/PartnerControls">
-  <documentManagement>
-    <_ip_UnifiedCompliancePolicyUIAction xmlns="http://schemas.microsoft.com/sharepoint/v3" xsi:nil="true"/>
-    <_ip_UnifiedCompliancePolicyProperties xmlns="http://schemas.microsoft.com/sharepoint/v3" xsi:nil="true"/>
-    <TaxCatchAll xmlns="8b5671ec-d820-46eb-b915-4cb6a0c57ac2" xsi:nil="true"/>
-    <lcf76f155ced4ddcb4097134ff3c332f xmlns="fc3c24a1-568e-439a-b362-56fd2d714a95">
-      <Terms xmlns="http://schemas.microsoft.com/office/infopath/2007/PartnerControls"/>
-    </lcf76f155ced4ddcb4097134ff3c332f>
-    <SharedWithUsers xmlns="8b5671ec-d820-46eb-b915-4cb6a0c57ac2">
-      <UserInfo>
-        <DisplayName/>
-        <AccountId xsi:nil="true"/>
-        <AccountType/>
-      </UserInfo>
-    </SharedWithUsers>
-  </documentManagement>
-</p:properties>
-</file>
-
-<file path=customXml/item2.xml><?xml version="1.0" encoding="utf-8"?>
 <ct:contentTypeSchema xmlns:ct="http://schemas.microsoft.com/office/2006/metadata/contentType" xmlns:ma="http://schemas.microsoft.com/office/2006/metadata/properties/metaAttributes" ct:_="" ma:_="" ma:contentTypeName="Document" ma:contentTypeID="0x010100DF323F649DC78242896C54FFE69D7634" ma:contentTypeVersion="16" ma:contentTypeDescription="Create a new document." ma:contentTypeScope="" ma:versionID="05ece8de6363c0d456b2e6288aa41260">
   <xsd:schema xmlns:xsd="http://www.w3.org/2001/XMLSchema" xmlns:xs="http://www.w3.org/2001/XMLSchema" xmlns:p="http://schemas.microsoft.com/office/2006/metadata/properties" xmlns:ns1="http://schemas.microsoft.com/sharepoint/v3" xmlns:ns2="fc3c24a1-568e-439a-b362-56fd2d714a95" xmlns:ns3="8b5671ec-d820-46eb-b915-4cb6a0c57ac2" targetNamespace="http://schemas.microsoft.com/office/2006/metadata/properties" ma:root="true" ma:fieldsID="759319a5f06704609a11beac1a5f7010" ns1:_="" ns2:_="" ns3:_="">
     <xsd:import namespace="http://schemas.microsoft.com/sharepoint/v3"/>
@@ -6208,11 +6576,27 @@
 </ct:contentTypeSchema>
 </file>
 
-<file path=customXml/item3.xml><?xml version="1.0" encoding="utf-8"?>
-<b:Sources xmlns:b="http://schemas.openxmlformats.org/officeDocument/2006/bibliography" xmlns="http://schemas.openxmlformats.org/officeDocument/2006/bibliography" SelectedStyle="\APASixthEditionOfficeOnline.xsl" StyleName="APA" Version="6"/>
+<file path=customXml/item2.xml><?xml version="1.0" encoding="utf-8"?>
+<p:properties xmlns:p="http://schemas.microsoft.com/office/2006/metadata/properties" xmlns:xsi="http://www.w3.org/2001/XMLSchema-instance" xmlns:pc="http://schemas.microsoft.com/office/infopath/2007/PartnerControls">
+  <documentManagement>
+    <_ip_UnifiedCompliancePolicyUIAction xmlns="http://schemas.microsoft.com/sharepoint/v3" xsi:nil="true"/>
+    <_ip_UnifiedCompliancePolicyProperties xmlns="http://schemas.microsoft.com/sharepoint/v3" xsi:nil="true"/>
+    <TaxCatchAll xmlns="8b5671ec-d820-46eb-b915-4cb6a0c57ac2" xsi:nil="true"/>
+    <lcf76f155ced4ddcb4097134ff3c332f xmlns="fc3c24a1-568e-439a-b362-56fd2d714a95">
+      <Terms xmlns="http://schemas.microsoft.com/office/infopath/2007/PartnerControls"/>
+    </lcf76f155ced4ddcb4097134ff3c332f>
+    <SharedWithUsers xmlns="8b5671ec-d820-46eb-b915-4cb6a0c57ac2">
+      <UserInfo>
+        <DisplayName/>
+        <AccountId xsi:nil="true"/>
+        <AccountType/>
+      </UserInfo>
+    </SharedWithUsers>
+  </documentManagement>
+</p:properties>
 </file>
 
-<file path=customXml/item4.xml><?xml version="1.0" encoding="utf-8"?>
+<file path=customXml/item3.xml><?xml version="1.0" encoding="utf-8"?>
 <?mso-contentType ?>
 <FormTemplates xmlns="http://schemas.microsoft.com/sharepoint/v3/contenttype/forms">
   <Display>DocumentLibraryForm</Display>
@@ -6221,19 +6605,11 @@
 </FormTemplates>
 </file>
 
-<file path=customXml/itemProps1.xml><?xml version="1.0" encoding="utf-8"?>
-<ds:datastoreItem xmlns:ds="http://schemas.openxmlformats.org/officeDocument/2006/customXml" ds:itemID="{89516BF2-C96D-4873-9EC6-6D1D8CFB0312}">
-  <ds:schemaRefs>
-    <ds:schemaRef ds:uri="http://schemas.microsoft.com/office/2006/metadata/properties"/>
-    <ds:schemaRef ds:uri="http://schemas.microsoft.com/office/infopath/2007/PartnerControls"/>
-    <ds:schemaRef ds:uri="http://schemas.microsoft.com/sharepoint/v3"/>
-    <ds:schemaRef ds:uri="8b5671ec-d820-46eb-b915-4cb6a0c57ac2"/>
-    <ds:schemaRef ds:uri="fc3c24a1-568e-439a-b362-56fd2d714a95"/>
-  </ds:schemaRefs>
-</ds:datastoreItem>
+<file path=customXml/item4.xml><?xml version="1.0" encoding="utf-8"?>
+<b:Sources xmlns:b="http://schemas.openxmlformats.org/officeDocument/2006/bibliography" xmlns="http://schemas.openxmlformats.org/officeDocument/2006/bibliography" SelectedStyle="\APASixthEditionOfficeOnline.xsl" StyleName="APA" Version="6"/>
 </file>
 
-<file path=customXml/itemProps2.xml><?xml version="1.0" encoding="utf-8"?>
+<file path=customXml/itemProps1.xml><?xml version="1.0" encoding="utf-8"?>
 <ds:datastoreItem xmlns:ds="http://schemas.openxmlformats.org/officeDocument/2006/customXml" ds:itemID="{FC52E985-3702-4E05-8818-41B91504D12B}">
   <ds:schemaRefs>
     <ds:schemaRef ds:uri="http://schemas.microsoft.com/office/2006/metadata/contentType"/>
@@ -6253,18 +6629,30 @@
 </ds:datastoreItem>
 </file>
 
+<file path=customXml/itemProps2.xml><?xml version="1.0" encoding="utf-8"?>
+<ds:datastoreItem xmlns:ds="http://schemas.openxmlformats.org/officeDocument/2006/customXml" ds:itemID="{89516BF2-C96D-4873-9EC6-6D1D8CFB0312}">
+  <ds:schemaRefs>
+    <ds:schemaRef ds:uri="http://schemas.microsoft.com/office/2006/metadata/properties"/>
+    <ds:schemaRef ds:uri="http://schemas.microsoft.com/office/infopath/2007/PartnerControls"/>
+    <ds:schemaRef ds:uri="http://schemas.microsoft.com/sharepoint/v3"/>
+    <ds:schemaRef ds:uri="8b5671ec-d820-46eb-b915-4cb6a0c57ac2"/>
+    <ds:schemaRef ds:uri="fc3c24a1-568e-439a-b362-56fd2d714a95"/>
+  </ds:schemaRefs>
+</ds:datastoreItem>
+</file>
+
 <file path=customXml/itemProps3.xml><?xml version="1.0" encoding="utf-8"?>
+<ds:datastoreItem xmlns:ds="http://schemas.openxmlformats.org/officeDocument/2006/customXml" ds:itemID="{FBE41C5A-CBE3-4F1D-922F-1D7D4DB8C79D}">
+  <ds:schemaRefs>
+    <ds:schemaRef ds:uri="http://schemas.microsoft.com/sharepoint/v3/contenttype/forms"/>
+  </ds:schemaRefs>
+</ds:datastoreItem>
+</file>
+
+<file path=customXml/itemProps4.xml><?xml version="1.0" encoding="utf-8"?>
 <ds:datastoreItem xmlns:ds="http://schemas.openxmlformats.org/officeDocument/2006/customXml" ds:itemID="{912E31F6-BD56-4192-B2F1-8C538456DD53}">
   <ds:schemaRefs>
     <ds:schemaRef ds:uri="http://schemas.openxmlformats.org/officeDocument/2006/bibliography"/>
   </ds:schemaRefs>
 </ds:datastoreItem>
-</file>
-
-<file path=customXml/itemProps4.xml><?xml version="1.0" encoding="utf-8"?>
-<ds:datastoreItem xmlns:ds="http://schemas.openxmlformats.org/officeDocument/2006/customXml" ds:itemID="{FBE41C5A-CBE3-4F1D-922F-1D7D4DB8C79D}">
-  <ds:schemaRefs>
-    <ds:schemaRef ds:uri="http://schemas.microsoft.com/sharepoint/v3/contenttype/forms"/>
-  </ds:schemaRefs>
-</ds:datastoreItem>
 </file>
</xml_diff>